<commit_message>
Add Keys (MpMq) tab: Prioritised Key Findings cards + 4 recurrence charts
- New Keys (MpMq) tab with screenshot-style '07 Prioritised Key Findings'
  2×2 card grid: top-4 recurring themes each showing evidence stats,
  clinical impact, suggested response, and NSQHS/AHPEQS anchor pills
- Supporting data: _KEYS_FINDING_TITLE (15 authored finding sentences),
  _KEYS_SUGGESTED_RESPONSE (15 per-theme action recommendations)
- Four analytic charts: theme recurrence bubble map, monthly heatmap,
  co-occurrence matrix, and persistence × breadth overlay bars
- Recurrence summary table with persistence, breadth, recurrence score,
  and top co-occurring theme per AHPEQS-aligned semantic theme
- _compute_theme_recurrence() computes persistence/breadth/co-occurrence
  across all patient-month slots without requiring model inference

Co-Authored-By: Claude Sonnet 4.6 <noreply@anthropic.com>
</commit_message>
<xml_diff>
--- a/ML/sentiment/nltk-transformer/nlp-analyzer/nlp-openmed-sentiment-analysis-finetuned-models/docs/NLP_OpenMed_Sentiment_Analysis_API_Integration_Guide_v3.docx
+++ b/ML/sentiment/nltk-transformer/nlp-analyzer/nlp-openmed-sentiment-analysis-finetuned-models/docs/NLP_OpenMed_Sentiment_Analysis_API_Integration_Guide_v3.docx
@@ -62,7 +62,7 @@
           <w:color w:val="333333"/>
           <w:sz w:val="20"/>
         </w:rPr>
-        <w:t xml:space="preserve">2.0     </w:t>
+        <w:t xml:space="preserve">3.0     </w:t>
       </w:r>
       <w:r>
         <w:rPr>
@@ -77,7 +77,7 @@
           <w:color w:val="333333"/>
           <w:sz w:val="20"/>
         </w:rPr>
-        <w:t xml:space="preserve">May 2026     </w:t>
+        <w:t xml:space="preserve">June 2026     </w:t>
       </w:r>
       <w:r>
         <w:rPr>
@@ -92,7 +92,7 @@
           <w:color w:val="333333"/>
           <w:sz w:val="20"/>
         </w:rPr>
-        <w:t xml:space="preserve">Local / Docker     </w:t>
+        <w:t xml:space="preserve">Local / Docker / AWS Lambda     </w:t>
       </w:r>
     </w:p>
     <w:p>
@@ -1439,7 +1439,9 @@
                 <w:color w:val="1A1A2E"/>
                 <w:sz w:val="17"/>
               </w:rPr>
-              <w:t>http://localhost:8000/api/v1</w:t>
+              <w:t>Local:  http://localhost:8000/api/v1</w:t>
+              <w:br/>
+              <w:t>AWS:    https://ws1gaxke8i.execute-api.ap-southeast-2.amazonaws.com/prod/api/v1</w:t>
             </w:r>
           </w:p>
         </w:tc>
@@ -1480,7 +1482,9 @@
           <w:color w:val="333333"/>
           <w:sz w:val="21"/>
         </w:rPr>
-        <w:t>The local API has no API key requirement. All endpoints are open when running locally. The only external credential is the OpenMed PII key, which is configured in .env and is used server-side — you never need to include it in your API calls.</w:t>
+        <w:t>The local API has no API key requirement. All endpoints are open when running locally. The only external credential is the OpenMed PII API key set in the .env file (see Step 3).</w:t>
+        <w:br/>
+        <w:t>The AWS Lambda deployment requires an x-api-key header on every request — add -H "x-api-key: jRkqkFo7Ap6fbwMCjrgVt5pTk8ICLSXe90Fw8hYB" to every curl call, or include it in your HTTP client headers.</w:t>
       </w:r>
     </w:p>
     <w:p>
@@ -5319,7 +5323,16 @@
                 <w:color w:val="1A1A2E"/>
                 <w:sz w:val="17"/>
               </w:rPr>
+              <w:t># Local</w:t>
+              <w:br/>
               <w:t>curl -s http://localhost:8000/api/v1/health | python3 -m json.tool</w:t>
+              <w:br/>
+              <w:br/>
+              <w:t># AWS</w:t>
+              <w:br/>
+              <w:t>curl -s https://ws1gaxke8i.execute-api.ap-southeast-2.amazonaws.com/prod/api/v1/health \</w:t>
+              <w:br/>
+              <w:t xml:space="preserve">  -H "x-api-key: jRkqkFo7Ap6fbwMCjrgVt5pTk8ICLSXe90Fw8hYB" | python3 -m json.tool</w:t>
             </w:r>
           </w:p>
         </w:tc>
@@ -5365,7 +5378,16 @@
                 <w:color w:val="1A1A2E"/>
                 <w:sz w:val="17"/>
               </w:rPr>
+              <w:t># Local</w:t>
+              <w:br/>
               <w:t>curl -s http://localhost:8000/api/v1/warmup | python3 -m json.tool</w:t>
+              <w:br/>
+              <w:br/>
+              <w:t># AWS</w:t>
+              <w:br/>
+              <w:t>curl -s https://ws1gaxke8i.execute-api.ap-southeast-2.amazonaws.com/prod/api/v1/warmup \</w:t>
+              <w:br/>
+              <w:t xml:space="preserve">  -H "x-api-key: jRkqkFo7Ap6fbwMCjrgVt5pTk8ICLSXe90Fw8hYB" | python3 -m json.tool</w:t>
             </w:r>
           </w:p>
         </w:tc>
@@ -5411,7 +5433,28 @@
                 <w:color w:val="1A1A2E"/>
                 <w:sz w:val="17"/>
               </w:rPr>
+              <w:t># Local</w:t>
+              <w:br/>
               <w:t>curl -s -X POST http://localhost:8000/api/v1/analyze \</w:t>
+              <w:br/>
+              <w:t xml:space="preserve">  -H "Content-Type: application/json" \</w:t>
+              <w:br/>
+              <w:t xml:space="preserve">  -d '{"text": "The nurse was attentive and the ward was clean.", "model_type": "bert_hc_v2"}' \</w:t>
+              <w:br/>
+              <w:t xml:space="preserve">  | python3 -m json.tool</w:t>
+              <w:br/>
+              <w:br/>
+              <w:t># AWS</w:t>
+              <w:br/>
+              <w:t>curl -s -X POST https://ws1gaxke8i.execute-api.ap-southeast-2.amazonaws.com/prod/api/v1/analyze \</w:t>
+              <w:br/>
+              <w:t xml:space="preserve">  -H "x-api-key: jRkqkFo7Ap6fbwMCjrgVt5pTk8ICLSXe90Fw8hYB" \</w:t>
+              <w:br/>
+              <w:t xml:space="preserve">  -H "Content-Type: application/json" \</w:t>
+              <w:br/>
+              <w:t xml:space="preserve">  -d '{"text": "The nurse was attentive and the ward was clean.", "model_type": "bert_hc_v2"}' \</w:t>
+              <w:br/>
+              <w:t xml:space="preserve">  | python3 -m json.tool</w:t>
             </w:r>
           </w:p>
           <w:p>
@@ -5509,7 +5552,28 @@
                 <w:color w:val="1A1A2E"/>
                 <w:sz w:val="17"/>
               </w:rPr>
+              <w:t># Local</w:t>
+              <w:br/>
               <w:t>curl -s -X POST http://localhost:8000/api/v1/analyze \</w:t>
+              <w:br/>
+              <w:t xml:space="preserve">  -H "Content-Type: application/json" \</w:t>
+              <w:br/>
+              <w:t xml:space="preserve">  -d '{"text": "I waited hours and no one came.", "model_type": "distilroberta_hc_v2"}' \</w:t>
+              <w:br/>
+              <w:t xml:space="preserve">  | python3 -m json.tool</w:t>
+              <w:br/>
+              <w:br/>
+              <w:t># AWS</w:t>
+              <w:br/>
+              <w:t>curl -s -X POST https://ws1gaxke8i.execute-api.ap-southeast-2.amazonaws.com/prod/api/v1/analyze \</w:t>
+              <w:br/>
+              <w:t xml:space="preserve">  -H "x-api-key: jRkqkFo7Ap6fbwMCjrgVt5pTk8ICLSXe90Fw8hYB" \</w:t>
+              <w:br/>
+              <w:t xml:space="preserve">  -H "Content-Type: application/json" \</w:t>
+              <w:br/>
+              <w:t xml:space="preserve">  -d '{"text": "I waited hours and no one came.", "model_type": "distilroberta_hc_v2"}' \</w:t>
+              <w:br/>
+              <w:t xml:space="preserve">  | python3 -m json.tool</w:t>
             </w:r>
           </w:p>
           <w:p>
@@ -5703,6 +5767,13 @@
                 <w:sz w:val="17"/>
               </w:rPr>
               <w:t>BASE_URL = "http://localhost:8000/api/v1"</w:t>
+              <w:br/>
+              <w:br/>
+              <w:t># AWS Lambda — uncomment to use:</w:t>
+              <w:br/>
+              <w:t># BASE_URL = "https://ws1gaxke8i.execute-api.ap-southeast-2.amazonaws.com/prod/api/v1"</w:t>
+              <w:br/>
+              <w:t># HEADERS  = {"Content-Type": "application/json", "x-api-key": "jRkqkFo7Ap6fbwMCjrgVt5pTk8ICLSXe90Fw8hYB"}</w:t>
             </w:r>
           </w:p>
           <w:p>
@@ -6017,6 +6088,13 @@
                 <w:sz w:val="17"/>
               </w:rPr>
               <w:t>BASE_URL   = "http://localhost:8000/api/v1"</w:t>
+              <w:br/>
+              <w:br/>
+              <w:t># AWS Lambda — uncomment to use:</w:t>
+              <w:br/>
+              <w:t># BASE_URL = "https://ws1gaxke8i.execute-api.ap-southeast-2.amazonaws.com/prod/api/v1"</w:t>
+              <w:br/>
+              <w:t># HEADERS  = {"Content-Type": "application/json", "x-api-key": "jRkqkFo7Ap6fbwMCjrgVt5pTk8ICLSXe90Fw8hYB"}</w:t>
             </w:r>
           </w:p>
           <w:p>
@@ -6372,6 +6450,13 @@
                 <w:sz w:val="17"/>
               </w:rPr>
               <w:t>BASE_URL = "http://localhost:8000/api/v1"</w:t>
+              <w:br/>
+              <w:br/>
+              <w:t># AWS Lambda — uncomment to use:</w:t>
+              <w:br/>
+              <w:t># BASE_URL = "https://ws1gaxke8i.execute-api.ap-southeast-2.amazonaws.com/prod/api/v1"</w:t>
+              <w:br/>
+              <w:t># HEADERS  = {"Content-Type": "application/json", "x-api-key": "jRkqkFo7Ap6fbwMCjrgVt5pTk8ICLSXe90Fw8hYB"}</w:t>
             </w:r>
           </w:p>
           <w:p>
@@ -6803,6 +6888,13 @@
                 <w:sz w:val="17"/>
               </w:rPr>
               <w:t>BASE_URL = "http://localhost:8000/api/v1"</w:t>
+              <w:br/>
+              <w:br/>
+              <w:t># AWS Lambda — uncomment to use:</w:t>
+              <w:br/>
+              <w:t># BASE_URL = "https://ws1gaxke8i.execute-api.ap-southeast-2.amazonaws.com/prod/api/v1"</w:t>
+              <w:br/>
+              <w:t># HEADERS  = {"Content-Type": "application/json", "x-api-key": "jRkqkFo7Ap6fbwMCjrgVt5pTk8ICLSXe90Fw8hYB"}</w:t>
             </w:r>
           </w:p>
           <w:p>
@@ -7181,7 +7273,18 @@
                 <w:color w:val="1A1A2E"/>
                 <w:sz w:val="17"/>
               </w:rPr>
+              <w:t>// Local</w:t>
+              <w:br/>
               <w:t>const BASE_URL = "http://localhost:8000/api/v1";</w:t>
+              <w:br/>
+              <w:t>const HEADERS = { "Content-Type": "application/json" };</w:t>
+              <w:br/>
+              <w:br/>
+              <w:t>// AWS Lambda</w:t>
+              <w:br/>
+              <w:t>// const BASE_URL = "https://ws1gaxke8i.execute-api.ap-southeast-2.amazonaws.com/prod/api/v1";</w:t>
+              <w:br/>
+              <w:t>// const HEADERS = { "Content-Type": "application/json", "x-api-key": "jRkqkFo7Ap6fbwMCjrgVt5pTk8ICLSXe90Fw8hYB" };</w:t>
             </w:r>
           </w:p>
           <w:p>
@@ -7685,7 +7788,18 @@
                 <w:color w:val="1A1A2E"/>
                 <w:sz w:val="17"/>
               </w:rPr>
+              <w:t># Local</w:t>
+              <w:br/>
               <w:t>BASE=http://localhost:8000/api/v1</w:t>
+              <w:br/>
+              <w:br/>
+              <w:t># AWS Lambda</w:t>
+              <w:br/>
+              <w:t># BASE=https://ws1gaxke8i.execute-api.ap-southeast-2.amazonaws.com/prod/api/v1</w:t>
+              <w:br/>
+              <w:t># KEY=jRkqkFo7Ap6fbwMCjrgVt5pTk8ICLSXe90Fw8hYB</w:t>
+              <w:br/>
+              <w:t># Then add:  -H "x-api-key: $KEY"  to every curl call below</w:t>
             </w:r>
           </w:p>
         </w:tc>
@@ -9134,6 +9248,68 @@
                 <w:sz w:val="19"/>
               </w:rPr>
               <w:t>Run uvicorn api.main:app --host 0.0.0.0 --port 8000 --reload to restart.</w:t>
+            </w:r>
+          </w:p>
+        </w:tc>
+      </w:tr>
+      <w:tr>
+        <w:tc>
+          <w:tcPr>
+            <w:tcW w:type="dxa" w:w="1247"/>
+            <w:vAlign w:val="center"/>
+          </w:tcPr>
+          <w:p>
+            <w:r>
+              <w:rPr>
+                <w:color w:val="333333"/>
+                <w:sz w:val="19"/>
+              </w:rPr>
+              <w:t>403</w:t>
+            </w:r>
+          </w:p>
+        </w:tc>
+        <w:tc>
+          <w:tcPr>
+            <w:tcW w:type="dxa" w:w="1984"/>
+            <w:vAlign w:val="center"/>
+          </w:tcPr>
+          <w:p>
+            <w:r>
+              <w:rPr>
+                <w:color w:val="333333"/>
+                <w:sz w:val="19"/>
+              </w:rPr>
+              <w:t>Forbidden</w:t>
+            </w:r>
+          </w:p>
+        </w:tc>
+        <w:tc>
+          <w:tcPr>
+            <w:tcW w:type="dxa" w:w="3402"/>
+            <w:vAlign w:val="center"/>
+          </w:tcPr>
+          <w:p>
+            <w:r>
+              <w:rPr>
+                <w:color w:val="333333"/>
+                <w:sz w:val="19"/>
+              </w:rPr>
+              <w:t>x-api-key header is missing or invalid (AWS deployment only).</w:t>
+            </w:r>
+          </w:p>
+        </w:tc>
+        <w:tc>
+          <w:tcPr>
+            <w:tcW w:type="dxa" w:w="2835"/>
+            <w:vAlign w:val="center"/>
+          </w:tcPr>
+          <w:p>
+            <w:r>
+              <w:rPr>
+                <w:color w:val="333333"/>
+                <w:sz w:val="19"/>
+              </w:rPr>
+              <w:t>Add -H "x-api-key: &lt;your-key&gt;" to every request. Obtain the key from your AWS team lead.</w:t>
             </w:r>
           </w:p>
         </w:tc>
@@ -11855,6 +12031,13 @@
                 <w:sz w:val="17"/>
               </w:rPr>
               <w:t># Start server</w:t>
+              <w:br/>
+              <w:br/>
+              <w:t># AWS endpoint (no server needed)</w:t>
+              <w:br/>
+              <w:t># https://ws1gaxke8i.execute-api.ap-southeast-2.amazonaws.com/prod</w:t>
+              <w:br/>
+              <w:t># x-api-key: jRkqkFo7Ap6fbwMCjrgVt5pTk8ICLSXe90Fw8hYB</w:t>
             </w:r>
           </w:p>
           <w:p>
@@ -12901,7 +13084,22 @@
                 <w:color w:val="1A1A2E"/>
                 <w:sz w:val="17"/>
               </w:rPr>
+              <w:t># Local</w:t>
+              <w:br/>
               <w:t>curl -s -X POST http://localhost:8000/api/v1/analyze \</w:t>
+              <w:br/>
+              <w:br/>
+              <w:t># AWS</w:t>
+              <w:br/>
+              <w:t>curl -s -X POST https://ws1gaxke8i.execute-api.ap-southeast-2.amazonaws.com/prod/api/v1/analyze \</w:t>
+              <w:br/>
+              <w:t xml:space="preserve">  -H "x-api-key: jRkqkFo7Ap6fbwMCjrgVt5pTk8ICLSXe90Fw8hYB" \</w:t>
+              <w:br/>
+              <w:t xml:space="preserve">  -H "Content-Type: application/json" \</w:t>
+              <w:br/>
+              <w:t xml:space="preserve">  -d '{"text": "The nurse was attentive and the ward was clean.", "model_type": "bert_hc_v2"}' \</w:t>
+              <w:br/>
+              <w:t xml:space="preserve">  | python3 -m json.tool</w:t>
             </w:r>
           </w:p>
           <w:p>
@@ -12986,84 +13184,90 @@
                 <w:sz w:val="17"/>
               </w:rPr>
               <w:t>import requests</w:t>
-            </w:r>
-          </w:p>
-          <w:p>
-            <w:pPr>
-              <w:spacing w:before="0" w:after="0"/>
-            </w:pPr>
-            <w:r>
-              <w:rPr>
-                <w:rFonts w:ascii="Courier New" w:hAnsi="Courier New"/>
-                <w:color w:val="1A1A2E"/>
-                <w:sz w:val="17"/>
-              </w:rPr>
+              <w:br/>
               <w:t>r = requests.post(</w:t>
-            </w:r>
-          </w:p>
-          <w:p>
-            <w:pPr>
-              <w:spacing w:before="0" w:after="0"/>
-            </w:pPr>
-            <w:r>
-              <w:rPr>
-                <w:rFonts w:ascii="Courier New" w:hAnsi="Courier New"/>
-                <w:color w:val="1A1A2E"/>
-                <w:sz w:val="17"/>
-              </w:rPr>
-              <w:t xml:space="preserve">    "http://localhost:8000/api/v1/analyze",</w:t>
-            </w:r>
-          </w:p>
-          <w:p>
-            <w:pPr>
-              <w:spacing w:before="0" w:after="0"/>
-            </w:pPr>
-            <w:r>
-              <w:rPr>
-                <w:rFonts w:ascii="Courier New" w:hAnsi="Courier New"/>
-                <w:color w:val="1A1A2E"/>
-                <w:sz w:val="17"/>
-              </w:rPr>
-              <w:t xml:space="preserve">    headers={"Content-Type": "application/json"},</w:t>
-            </w:r>
-          </w:p>
-          <w:p>
-            <w:pPr>
-              <w:spacing w:before="0" w:after="0"/>
-            </w:pPr>
-            <w:r>
-              <w:rPr>
-                <w:rFonts w:ascii="Courier New" w:hAnsi="Courier New"/>
-                <w:color w:val="1A1A2E"/>
-                <w:sz w:val="17"/>
-              </w:rPr>
+              <w:br/>
+              <w:t xml:space="preserve">    "https://ws1gaxke8i.execute-api.ap-southeast-2.amazonaws.com/prod/api/v1/analyze",</w:t>
+              <w:br/>
+              <w:t xml:space="preserve">    headers={"Content-Type": "application/json", "x-api-key": "jRkqkFo7Ap6fbwMCjrgVt5pTk8ICLSXe90Fw8hYB"},</w:t>
+              <w:br/>
               <w:t xml:space="preserve">    json={"text": "YOUR TEXT HERE", "model_type": "bert_hc_v2"},</w:t>
-            </w:r>
-          </w:p>
-          <w:p>
-            <w:pPr>
-              <w:spacing w:before="0" w:after="0"/>
-            </w:pPr>
-            <w:r>
-              <w:rPr>
-                <w:rFonts w:ascii="Courier New" w:hAnsi="Courier New"/>
-                <w:color w:val="1A1A2E"/>
-                <w:sz w:val="17"/>
-              </w:rPr>
+              <w:br/>
               <w:t>)</w:t>
-            </w:r>
-          </w:p>
-          <w:p>
-            <w:pPr>
-              <w:spacing w:before="0" w:after="0"/>
-            </w:pPr>
-            <w:r>
-              <w:rPr>
-                <w:rFonts w:ascii="Courier New" w:hAnsi="Courier New"/>
-                <w:color w:val="1A1A2E"/>
-                <w:sz w:val="17"/>
-              </w:rPr>
+              <w:br/>
               <w:t>print(r.json()["sentiment"], r.json()["redacted_text"])</w:t>
+            </w:r>
+          </w:p>
+          <w:p>
+            <w:pPr>
+              <w:spacing w:before="0" w:after="0"/>
+            </w:pPr>
+            <w:r>
+              <w:rPr>
+                <w:rFonts w:ascii="Courier New" w:hAnsi="Courier New"/>
+                <w:color w:val="1A1A2E"/>
+                <w:sz w:val="17"/>
+              </w:rPr>
+            </w:r>
+          </w:p>
+          <w:p>
+            <w:pPr>
+              <w:spacing w:before="0" w:after="0"/>
+            </w:pPr>
+            <w:r>
+              <w:rPr>
+                <w:rFonts w:ascii="Courier New" w:hAnsi="Courier New"/>
+                <w:color w:val="1A1A2E"/>
+                <w:sz w:val="17"/>
+              </w:rPr>
+            </w:r>
+          </w:p>
+          <w:p>
+            <w:pPr>
+              <w:spacing w:before="0" w:after="0"/>
+            </w:pPr>
+            <w:r>
+              <w:rPr>
+                <w:rFonts w:ascii="Courier New" w:hAnsi="Courier New"/>
+                <w:color w:val="1A1A2E"/>
+                <w:sz w:val="17"/>
+              </w:rPr>
+            </w:r>
+          </w:p>
+          <w:p>
+            <w:pPr>
+              <w:spacing w:before="0" w:after="0"/>
+            </w:pPr>
+            <w:r>
+              <w:rPr>
+                <w:rFonts w:ascii="Courier New" w:hAnsi="Courier New"/>
+                <w:color w:val="1A1A2E"/>
+                <w:sz w:val="17"/>
+              </w:rPr>
+            </w:r>
+          </w:p>
+          <w:p>
+            <w:pPr>
+              <w:spacing w:before="0" w:after="0"/>
+            </w:pPr>
+            <w:r>
+              <w:rPr>
+                <w:rFonts w:ascii="Courier New" w:hAnsi="Courier New"/>
+                <w:color w:val="1A1A2E"/>
+                <w:sz w:val="17"/>
+              </w:rPr>
+            </w:r>
+          </w:p>
+          <w:p>
+            <w:pPr>
+              <w:spacing w:before="0" w:after="0"/>
+            </w:pPr>
+            <w:r>
+              <w:rPr>
+                <w:rFonts w:ascii="Courier New" w:hAnsi="Courier New"/>
+                <w:color w:val="1A1A2E"/>
+                <w:sz w:val="17"/>
+              </w:rPr>
             </w:r>
           </w:p>
         </w:tc>
@@ -13347,6 +13551,53 @@
                 <w:sz w:val="19"/>
               </w:rPr>
               <w:t>Run uvicorn api.main:app --host 0.0.0.0 --port 8000.</w:t>
+            </w:r>
+          </w:p>
+        </w:tc>
+      </w:tr>
+      <w:tr>
+        <w:tc>
+          <w:tcPr>
+            <w:tcW w:type="dxa" w:w="1020"/>
+            <w:vAlign w:val="center"/>
+          </w:tcPr>
+          <w:p>
+            <w:r>
+              <w:rPr>
+                <w:color w:val="333333"/>
+                <w:sz w:val="19"/>
+              </w:rPr>
+              <w:t>403</w:t>
+            </w:r>
+          </w:p>
+        </w:tc>
+        <w:tc>
+          <w:tcPr>
+            <w:tcW w:type="dxa" w:w="1984"/>
+            <w:vAlign w:val="center"/>
+          </w:tcPr>
+          <w:p>
+            <w:r>
+              <w:rPr>
+                <w:color w:val="333333"/>
+                <w:sz w:val="19"/>
+              </w:rPr>
+              <w:t>Forbidden (AWS)</w:t>
+            </w:r>
+          </w:p>
+        </w:tc>
+        <w:tc>
+          <w:tcPr>
+            <w:tcW w:type="dxa" w:w="6350"/>
+            <w:vAlign w:val="center"/>
+          </w:tcPr>
+          <w:p>
+            <w:r>
+              <w:rPr>
+                <w:color w:val="333333"/>
+                <w:sz w:val="19"/>
+              </w:rPr>
+              <w:t>Add x-api-key header.</w:t>
             </w:r>
           </w:p>
         </w:tc>

</xml_diff>